<commit_message>
Agregar seccion de herramientas y tecnologias, y referencia a Cartero en la propuesta del proyecto
</commit_message>
<xml_diff>
--- a/docs/1-propuesta/Propuesta de Proyecto.docx
+++ b/docs/1-propuesta/Propuesta de Proyecto.docx
@@ -2770,7 +2770,27 @@
           <w:szCs w:val="24"/>
           <w:lang w:val="es-SV"/>
         </w:rPr>
-        <w:t>n México, el mercado de software educativo (EdTech) es amplio, con soluciones que van desde plataformas globales hasta sistemas adaptados a la normativa de la SEP. A continuación, se detallan las más relevantes:</w:t>
+        <w:t>n México, el mercado de software educativo (</w:t>
+      </w:r>
+      <w:proofErr w:type="spellStart"/>
+      <w:r>
+        <w:rPr>
+          <w:spacing w:val="-2"/>
+          <w:sz w:val="24"/>
+          <w:szCs w:val="24"/>
+          <w:lang w:val="es-SV"/>
+        </w:rPr>
+        <w:t>EdTech</w:t>
+      </w:r>
+      <w:proofErr w:type="spellEnd"/>
+      <w:r>
+        <w:rPr>
+          <w:spacing w:val="-2"/>
+          <w:sz w:val="24"/>
+          <w:szCs w:val="24"/>
+          <w:lang w:val="es-SV"/>
+        </w:rPr>
+        <w:t>) es amplio, con soluciones que van desde plataformas globales hasta sistemas adaptados a la normativa de la SEP. A continuación, se detallan las más relevantes:</w:t>
       </w:r>
     </w:p>
     <w:p>
@@ -3181,29 +3201,66 @@
           <w:szCs w:val="24"/>
           <w:lang w:val="es-SV"/>
         </w:rPr>
-        <w:t>3.-Google Classroom / Forms</w:t>
-      </w:r>
-    </w:p>
-    <w:p>
-      <w:pPr>
-        <w:tabs>
-          <w:tab w:val="left" w:pos="1524"/>
-        </w:tabs>
-        <w:spacing w:line="360" w:lineRule="auto"/>
-        <w:rPr>
+        <w:t xml:space="preserve">3.-Google </w:t>
+      </w:r>
+      <w:proofErr w:type="spellStart"/>
+      <w:r>
+        <w:rPr>
+          <w:b/>
+          <w:bCs/>
           <w:spacing w:val="-2"/>
           <w:sz w:val="24"/>
           <w:szCs w:val="24"/>
           <w:lang w:val="es-SV"/>
         </w:rPr>
-      </w:pPr>
-      <w:r>
-        <w:rPr>
+        <w:t>Classroom</w:t>
+      </w:r>
+      <w:proofErr w:type="spellEnd"/>
+      <w:r>
+        <w:rPr>
+          <w:b/>
+          <w:bCs/>
           <w:spacing w:val="-2"/>
           <w:sz w:val="24"/>
           <w:szCs w:val="24"/>
           <w:lang w:val="es-SV"/>
         </w:rPr>
+        <w:t xml:space="preserve"> / </w:t>
+      </w:r>
+      <w:proofErr w:type="spellStart"/>
+      <w:r>
+        <w:rPr>
+          <w:b/>
+          <w:bCs/>
+          <w:spacing w:val="-2"/>
+          <w:sz w:val="24"/>
+          <w:szCs w:val="24"/>
+          <w:lang w:val="es-SV"/>
+        </w:rPr>
+        <w:t>Forms</w:t>
+      </w:r>
+      <w:proofErr w:type="spellEnd"/>
+    </w:p>
+    <w:p>
+      <w:pPr>
+        <w:tabs>
+          <w:tab w:val="left" w:pos="1524"/>
+        </w:tabs>
+        <w:spacing w:line="360" w:lineRule="auto"/>
+        <w:rPr>
+          <w:spacing w:val="-2"/>
+          <w:sz w:val="24"/>
+          <w:szCs w:val="24"/>
+          <w:lang w:val="es-SV"/>
+        </w:rPr>
+      </w:pPr>
+      <w:r>
+        <w:rPr>
+          <w:spacing w:val="-2"/>
+          <w:sz w:val="24"/>
+          <w:szCs w:val="24"/>
+          <w:lang w:val="es-SV"/>
+        </w:rPr>
         <w:t>La solución gratuita más adoptada por docentes mexicanos durante y después de la pandemia.</w:t>
       </w:r>
     </w:p>
@@ -3423,7 +3480,39 @@
           <w:sz w:val="24"/>
           <w:szCs w:val="24"/>
         </w:rPr>
-        <w:t xml:space="preserve"> La interfaz elimina la complejidad de los grandes ERP escolares. El docente realiza el pase de lista en pocos segundos, reduciendo la fricción que causan sistemas como SchoolCloud o Seduca.</w:t>
+        <w:t xml:space="preserve"> La interfaz elimina la complejidad de los grandes ERP escolares. El docente realiza el pase de lista en pocos segundos, reduciendo la fricción que causan sistemas como </w:t>
+      </w:r>
+      <w:proofErr w:type="spellStart"/>
+      <w:r>
+        <w:rPr>
+          <w:sz w:val="24"/>
+          <w:szCs w:val="24"/>
+        </w:rPr>
+        <w:t>SchoolCloud</w:t>
+      </w:r>
+      <w:proofErr w:type="spellEnd"/>
+      <w:r>
+        <w:rPr>
+          <w:sz w:val="24"/>
+          <w:szCs w:val="24"/>
+        </w:rPr>
+        <w:t xml:space="preserve"> o </w:t>
+      </w:r>
+      <w:proofErr w:type="spellStart"/>
+      <w:r>
+        <w:rPr>
+          <w:sz w:val="24"/>
+          <w:szCs w:val="24"/>
+        </w:rPr>
+        <w:t>Seduca</w:t>
+      </w:r>
+      <w:proofErr w:type="spellEnd"/>
+      <w:r>
+        <w:rPr>
+          <w:sz w:val="24"/>
+          <w:szCs w:val="24"/>
+        </w:rPr>
+        <w:t>.</w:t>
       </w:r>
     </w:p>
     <w:p>
@@ -3749,7 +3838,31 @@
           <w:szCs w:val="24"/>
           <w14:ligatures w14:val="standardContextual"/>
         </w:rPr>
-        <w:t>El sistema presenta una alta viabilidad técnica al utilizar un stack tecnológico moderno, de código abierto y con amplia documentación, lo que minimiza los riesgos de desarrollo y facilita el mantenimiento futuro.</w:t>
+        <w:t xml:space="preserve">El sistema presenta una alta viabilidad técnica al utilizar un </w:t>
+      </w:r>
+      <w:proofErr w:type="spellStart"/>
+      <w:r>
+        <w:rPr>
+          <w:rFonts w:eastAsiaTheme="majorEastAsia"/>
+          <w:bCs/>
+          <w:kern w:val="2"/>
+          <w:sz w:val="24"/>
+          <w:szCs w:val="24"/>
+          <w14:ligatures w14:val="standardContextual"/>
+        </w:rPr>
+        <w:t>stack</w:t>
+      </w:r>
+      <w:proofErr w:type="spellEnd"/>
+      <w:r>
+        <w:rPr>
+          <w:rFonts w:eastAsiaTheme="majorEastAsia"/>
+          <w:bCs/>
+          <w:kern w:val="2"/>
+          <w:sz w:val="24"/>
+          <w:szCs w:val="24"/>
+          <w14:ligatures w14:val="standardContextual"/>
+        </w:rPr>
+        <w:t xml:space="preserve"> tecnológico moderno, de código abierto y con amplia documentación, lo que minimiza los riesgos de desarrollo y facilita el mantenimiento futuro.</w:t>
       </w:r>
     </w:p>
     <w:p>
@@ -3801,6 +3914,7 @@
           <w14:ligatures w14:val="standardContextual"/>
         </w:rPr>
       </w:pPr>
+      <w:proofErr w:type="spellStart"/>
       <w:r>
         <w:rPr>
           <w:rFonts w:eastAsiaTheme="majorEastAsia"/>
@@ -3810,18 +3924,54 @@
           <w:szCs w:val="24"/>
           <w14:ligatures w14:val="standardContextual"/>
         </w:rPr>
-        <w:t>Frontend:</w:t>
-      </w:r>
-      <w:r>
-        <w:rPr>
-          <w:rFonts w:eastAsiaTheme="majorEastAsia"/>
-          <w:bCs/>
-          <w:kern w:val="2"/>
-          <w:sz w:val="24"/>
-          <w:szCs w:val="24"/>
-          <w14:ligatures w14:val="standardContextual"/>
-        </w:rPr>
-        <w:t xml:space="preserve"> React (JavaScript</w:t>
+        <w:t>Frontend</w:t>
+      </w:r>
+      <w:proofErr w:type="spellEnd"/>
+      <w:r>
+        <w:rPr>
+          <w:rFonts w:eastAsiaTheme="majorEastAsia"/>
+          <w:b/>
+          <w:kern w:val="2"/>
+          <w:sz w:val="24"/>
+          <w:szCs w:val="24"/>
+          <w14:ligatures w14:val="standardContextual"/>
+        </w:rPr>
+        <w:t>:</w:t>
+      </w:r>
+      <w:r>
+        <w:rPr>
+          <w:rFonts w:eastAsiaTheme="majorEastAsia"/>
+          <w:bCs/>
+          <w:kern w:val="2"/>
+          <w:sz w:val="24"/>
+          <w:szCs w:val="24"/>
+          <w14:ligatures w14:val="standardContextual"/>
+        </w:rPr>
+        <w:t xml:space="preserve"> </w:t>
+      </w:r>
+      <w:proofErr w:type="spellStart"/>
+      <w:r>
+        <w:rPr>
+          <w:rFonts w:eastAsiaTheme="majorEastAsia"/>
+          <w:bCs/>
+          <w:kern w:val="2"/>
+          <w:sz w:val="24"/>
+          <w:szCs w:val="24"/>
+          <w14:ligatures w14:val="standardContextual"/>
+        </w:rPr>
+        <w:t>React</w:t>
+      </w:r>
+      <w:proofErr w:type="spellEnd"/>
+      <w:r>
+        <w:rPr>
+          <w:rFonts w:eastAsiaTheme="majorEastAsia"/>
+          <w:bCs/>
+          <w:kern w:val="2"/>
+          <w:sz w:val="24"/>
+          <w:szCs w:val="24"/>
+          <w14:ligatures w14:val="standardContextual"/>
+        </w:rPr>
+        <w:t xml:space="preserve"> (JavaScript</w:t>
       </w:r>
       <w:r>
         <w:rPr>
@@ -3858,6 +4008,7 @@
           <w14:ligatures w14:val="standardContextual"/>
         </w:rPr>
       </w:pPr>
+      <w:proofErr w:type="spellStart"/>
       <w:r>
         <w:rPr>
           <w:rFonts w:eastAsiaTheme="majorEastAsia"/>
@@ -3867,29 +4018,89 @@
           <w:szCs w:val="24"/>
           <w14:ligatures w14:val="standardContextual"/>
         </w:rPr>
-        <w:t>Backend:</w:t>
-      </w:r>
-      <w:r>
-        <w:rPr>
-          <w:rFonts w:eastAsiaTheme="majorEastAsia"/>
-          <w:bCs/>
-          <w:kern w:val="2"/>
-          <w:sz w:val="24"/>
-          <w:szCs w:val="24"/>
-          <w14:ligatures w14:val="standardContextual"/>
-        </w:rPr>
-        <w:t xml:space="preserve"> FastAPI (Python), seleccionado por su alto rendimiento y eficiencia en el manejo de peticiones asíncronas.</w:t>
-      </w:r>
-      <w:r>
-        <w:rPr>
-          <w:rFonts w:eastAsiaTheme="majorEastAsia"/>
-          <w:bCs/>
-          <w:kern w:val="2"/>
-          <w:sz w:val="24"/>
-          <w:szCs w:val="24"/>
-          <w14:ligatures w14:val="standardContextual"/>
-        </w:rPr>
-        <w:t xml:space="preserve"> Para esto se uso Anaconda como gestor de versiones de Python.</w:t>
+        <w:t>Backend</w:t>
+      </w:r>
+      <w:proofErr w:type="spellEnd"/>
+      <w:r>
+        <w:rPr>
+          <w:rFonts w:eastAsiaTheme="majorEastAsia"/>
+          <w:b/>
+          <w:kern w:val="2"/>
+          <w:sz w:val="24"/>
+          <w:szCs w:val="24"/>
+          <w14:ligatures w14:val="standardContextual"/>
+        </w:rPr>
+        <w:t>:</w:t>
+      </w:r>
+      <w:r>
+        <w:rPr>
+          <w:rFonts w:eastAsiaTheme="majorEastAsia"/>
+          <w:bCs/>
+          <w:kern w:val="2"/>
+          <w:sz w:val="24"/>
+          <w:szCs w:val="24"/>
+          <w14:ligatures w14:val="standardContextual"/>
+        </w:rPr>
+        <w:t xml:space="preserve"> </w:t>
+      </w:r>
+      <w:proofErr w:type="spellStart"/>
+      <w:r>
+        <w:rPr>
+          <w:rFonts w:eastAsiaTheme="majorEastAsia"/>
+          <w:bCs/>
+          <w:kern w:val="2"/>
+          <w:sz w:val="24"/>
+          <w:szCs w:val="24"/>
+          <w14:ligatures w14:val="standardContextual"/>
+        </w:rPr>
+        <w:t>FastAPI</w:t>
+      </w:r>
+      <w:proofErr w:type="spellEnd"/>
+      <w:r>
+        <w:rPr>
+          <w:rFonts w:eastAsiaTheme="majorEastAsia"/>
+          <w:bCs/>
+          <w:kern w:val="2"/>
+          <w:sz w:val="24"/>
+          <w:szCs w:val="24"/>
+          <w14:ligatures w14:val="standardContextual"/>
+        </w:rPr>
+        <w:t xml:space="preserve"> (Python), seleccionado por su alto rendimiento y eficiencia en el manejo de peticiones asíncronas.</w:t>
+      </w:r>
+      <w:r>
+        <w:rPr>
+          <w:rFonts w:eastAsiaTheme="majorEastAsia"/>
+          <w:bCs/>
+          <w:kern w:val="2"/>
+          <w:sz w:val="24"/>
+          <w:szCs w:val="24"/>
+          <w14:ligatures w14:val="standardContextual"/>
+        </w:rPr>
+        <w:t xml:space="preserve"> Para esto se </w:t>
+      </w:r>
+      <w:proofErr w:type="spellStart"/>
+      <w:r>
+        <w:rPr>
+          <w:rFonts w:eastAsiaTheme="majorEastAsia"/>
+          <w:bCs/>
+          <w:kern w:val="2"/>
+          <w:sz w:val="24"/>
+          <w:szCs w:val="24"/>
+          <w14:ligatures w14:val="standardContextual"/>
+        </w:rPr>
+        <w:t>uso</w:t>
+      </w:r>
+      <w:proofErr w:type="spellEnd"/>
+      <w:r>
+        <w:rPr>
+          <w:rFonts w:eastAsiaTheme="majorEastAsia"/>
+          <w:bCs/>
+          <w:kern w:val="2"/>
+          <w:sz w:val="24"/>
+          <w:szCs w:val="24"/>
+          <w14:ligatures w14:val="standardContextual"/>
+        </w:rPr>
+        <w:t xml:space="preserve"> Anaconda como gestor de versiones de Python.</w:t>
       </w:r>
     </w:p>
     <w:p>
@@ -5131,6 +5342,7 @@
         </w:rPr>
         <w:t xml:space="preserve">ncargado de base de datos y lógica del </w:t>
       </w:r>
+      <w:proofErr w:type="spellStart"/>
       <w:r>
         <w:rPr>
           <w:rFonts w:eastAsiaTheme="majorEastAsia"/>
@@ -5153,12 +5365,10 @@
           <w:lang w:val="es-SV"/>
           <w14:ligatures w14:val="standardContextual"/>
         </w:rPr>
-        <w:t>ackend.</w:t>
-      </w:r>
-    </w:p>
-    <w:p>
-      <w:pPr>
-        <w:spacing w:line="360" w:lineRule="auto"/>
+        <w:t>ackend</w:t>
+      </w:r>
+      <w:proofErr w:type="spellEnd"/>
+      <w:r>
         <w:rPr>
           <w:rFonts w:eastAsiaTheme="majorEastAsia"/>
           <w:bCs/>
@@ -5168,8 +5378,12 @@
           <w:lang w:val="es-SV"/>
           <w14:ligatures w14:val="standardContextual"/>
         </w:rPr>
-      </w:pPr>
-      <w:r>
+        <w:t>.</w:t>
+      </w:r>
+    </w:p>
+    <w:p>
+      <w:pPr>
+        <w:spacing w:line="360" w:lineRule="auto"/>
         <w:rPr>
           <w:rFonts w:eastAsiaTheme="majorEastAsia"/>
           <w:bCs/>
@@ -5179,6 +5393,17 @@
           <w:lang w:val="es-SV"/>
           <w14:ligatures w14:val="standardContextual"/>
         </w:rPr>
+      </w:pPr>
+      <w:r>
+        <w:rPr>
+          <w:rFonts w:eastAsiaTheme="majorEastAsia"/>
+          <w:bCs/>
+          <w:kern w:val="2"/>
+          <w:sz w:val="24"/>
+          <w:szCs w:val="24"/>
+          <w:lang w:val="es-SV"/>
+          <w14:ligatures w14:val="standardContextual"/>
+        </w:rPr>
         <w:t xml:space="preserve">-1 </w:t>
       </w:r>
       <w:r>
@@ -5203,7 +5428,33 @@
           <w:lang w:val="es-SV"/>
           <w14:ligatures w14:val="standardContextual"/>
         </w:rPr>
-        <w:t>esarrollador Frontend (interfaz de usuario).</w:t>
+        <w:t xml:space="preserve">esarrollador </w:t>
+      </w:r>
+      <w:proofErr w:type="spellStart"/>
+      <w:r>
+        <w:rPr>
+          <w:rFonts w:eastAsiaTheme="majorEastAsia"/>
+          <w:bCs/>
+          <w:kern w:val="2"/>
+          <w:sz w:val="24"/>
+          <w:szCs w:val="24"/>
+          <w:lang w:val="es-SV"/>
+          <w14:ligatures w14:val="standardContextual"/>
+        </w:rPr>
+        <w:t>Frontend</w:t>
+      </w:r>
+      <w:proofErr w:type="spellEnd"/>
+      <w:r>
+        <w:rPr>
+          <w:rFonts w:eastAsiaTheme="majorEastAsia"/>
+          <w:bCs/>
+          <w:kern w:val="2"/>
+          <w:sz w:val="24"/>
+          <w:szCs w:val="24"/>
+          <w:lang w:val="es-SV"/>
+          <w14:ligatures w14:val="standardContextual"/>
+        </w:rPr>
+        <w:t xml:space="preserve"> (interfaz de usuario).</w:t>
       </w:r>
     </w:p>
     <w:p>
@@ -5663,19 +5914,93 @@
           <w:szCs w:val="24"/>
           <w14:ligatures w14:val="standardContextual"/>
         </w:rPr>
-        <w:t>-Licencias opcionales para desarrollo de interfaz con Figma</w:t>
-      </w:r>
-      <w:r>
-        <w:rPr>
-          <w:rFonts w:eastAsiaTheme="majorEastAsia"/>
-          <w:bCs/>
-          <w:kern w:val="2"/>
-          <w:sz w:val="24"/>
-          <w:szCs w:val="24"/>
-          <w14:ligatures w14:val="standardContextual"/>
-        </w:rPr>
-        <w:t xml:space="preserve"> y Ecalidraw</w:t>
-      </w:r>
+        <w:t xml:space="preserve">-Cartero como cliente HTTP (gratuito, Open </w:t>
+      </w:r>
+      <w:proofErr w:type="spellStart"/>
+      <w:r>
+        <w:rPr>
+          <w:rFonts w:eastAsiaTheme="majorEastAsia"/>
+          <w:bCs/>
+          <w:kern w:val="2"/>
+          <w:sz w:val="24"/>
+          <w:szCs w:val="24"/>
+          <w14:ligatures w14:val="standardContextual"/>
+        </w:rPr>
+        <w:t>Source</w:t>
+      </w:r>
+      <w:proofErr w:type="spellEnd"/>
+      <w:r>
+        <w:rPr>
+          <w:rFonts w:eastAsiaTheme="majorEastAsia"/>
+          <w:bCs/>
+          <w:kern w:val="2"/>
+          <w:sz w:val="24"/>
+          <w:szCs w:val="24"/>
+          <w14:ligatures w14:val="standardContextual"/>
+        </w:rPr>
+        <w:t>).</w:t>
+      </w:r>
+    </w:p>
+    <w:p>
+      <w:pPr>
+        <w:spacing w:line="360" w:lineRule="auto"/>
+        <w:rPr>
+          <w:rFonts w:eastAsiaTheme="majorEastAsia"/>
+          <w:bCs/>
+          <w:kern w:val="2"/>
+          <w:sz w:val="24"/>
+          <w:szCs w:val="24"/>
+          <w14:ligatures w14:val="standardContextual"/>
+        </w:rPr>
+      </w:pPr>
+      <w:r>
+        <w:rPr>
+          <w:rFonts w:eastAsiaTheme="majorEastAsia"/>
+          <w:bCs/>
+          <w:kern w:val="2"/>
+          <w:sz w:val="24"/>
+          <w:szCs w:val="24"/>
+          <w14:ligatures w14:val="standardContextual"/>
+        </w:rPr>
+        <w:t xml:space="preserve">-Licencias opcionales para desarrollo de interfaz con </w:t>
+      </w:r>
+      <w:proofErr w:type="spellStart"/>
+      <w:r>
+        <w:rPr>
+          <w:rFonts w:eastAsiaTheme="majorEastAsia"/>
+          <w:bCs/>
+          <w:kern w:val="2"/>
+          <w:sz w:val="24"/>
+          <w:szCs w:val="24"/>
+          <w14:ligatures w14:val="standardContextual"/>
+        </w:rPr>
+        <w:t>Figma</w:t>
+      </w:r>
+      <w:proofErr w:type="spellEnd"/>
+      <w:r>
+        <w:rPr>
+          <w:rFonts w:eastAsiaTheme="majorEastAsia"/>
+          <w:bCs/>
+          <w:kern w:val="2"/>
+          <w:sz w:val="24"/>
+          <w:szCs w:val="24"/>
+          <w14:ligatures w14:val="standardContextual"/>
+        </w:rPr>
+        <w:t xml:space="preserve"> y </w:t>
+      </w:r>
+      <w:proofErr w:type="spellStart"/>
+      <w:r>
+        <w:rPr>
+          <w:rFonts w:eastAsiaTheme="majorEastAsia"/>
+          <w:bCs/>
+          <w:kern w:val="2"/>
+          <w:sz w:val="24"/>
+          <w:szCs w:val="24"/>
+          <w14:ligatures w14:val="standardContextual"/>
+        </w:rPr>
+        <w:t>Ecalidraw</w:t>
+      </w:r>
+      <w:proofErr w:type="spellEnd"/>
     </w:p>
     <w:p>
       <w:pPr>
@@ -5858,8 +6183,9 @@
           <w:lang w:val="es-SV"/>
           <w14:ligatures w14:val="standardContextual"/>
         </w:rPr>
-        <w:t>, para corrección de errores mínimos en el Backend</w:t>
-      </w:r>
+        <w:t xml:space="preserve">, para corrección de errores mínimos en el </w:t>
+      </w:r>
+      <w:proofErr w:type="spellStart"/>
       <w:r>
         <w:rPr>
           <w:rFonts w:eastAsiaTheme="majorEastAsia"/>
@@ -5870,6 +6196,19 @@
           <w:lang w:val="es-SV"/>
           <w14:ligatures w14:val="standardContextual"/>
         </w:rPr>
+        <w:t>Backend</w:t>
+      </w:r>
+      <w:proofErr w:type="spellEnd"/>
+      <w:r>
+        <w:rPr>
+          <w:rFonts w:eastAsiaTheme="majorEastAsia"/>
+          <w:bCs/>
+          <w:kern w:val="2"/>
+          <w:sz w:val="24"/>
+          <w:szCs w:val="24"/>
+          <w:lang w:val="es-SV"/>
+          <w14:ligatures w14:val="standardContextual"/>
+        </w:rPr>
         <w:t>*</w:t>
       </w:r>
     </w:p>
@@ -5938,7 +6277,31 @@
           <w:szCs w:val="24"/>
           <w14:ligatures w14:val="standardContextual"/>
         </w:rPr>
-        <w:t>Trello, Jira, Asana, MS Project, etc) para gestión del proyecto</w:t>
+        <w:t xml:space="preserve">Trello, Jira, Asana, MS Project, </w:t>
+      </w:r>
+      <w:proofErr w:type="spellStart"/>
+      <w:r>
+        <w:rPr>
+          <w:rFonts w:eastAsiaTheme="majorEastAsia"/>
+          <w:bCs/>
+          <w:kern w:val="2"/>
+          <w:sz w:val="24"/>
+          <w:szCs w:val="24"/>
+          <w14:ligatures w14:val="standardContextual"/>
+        </w:rPr>
+        <w:t>etc</w:t>
+      </w:r>
+      <w:proofErr w:type="spellEnd"/>
+      <w:r>
+        <w:rPr>
+          <w:rFonts w:eastAsiaTheme="majorEastAsia"/>
+          <w:bCs/>
+          <w:kern w:val="2"/>
+          <w:sz w:val="24"/>
+          <w:szCs w:val="24"/>
+          <w14:ligatures w14:val="standardContextual"/>
+        </w:rPr>
+        <w:t>) para gestión del proyecto</w:t>
       </w:r>
       <w:r>
         <w:rPr>
@@ -6622,7 +6985,23 @@
           <w:rFonts w:ascii="Times New Roman" w:hAnsi="Times New Roman" w:cs="Times New Roman"/>
           <w:lang w:val="es-419"/>
         </w:rPr>
-        <w:t>parcial, inter-ciclo o semestral)</w:t>
+        <w:t xml:space="preserve">parcial, </w:t>
+      </w:r>
+      <w:proofErr w:type="spellStart"/>
+      <w:r>
+        <w:rPr>
+          <w:rFonts w:ascii="Times New Roman" w:hAnsi="Times New Roman" w:cs="Times New Roman"/>
+          <w:lang w:val="es-419"/>
+        </w:rPr>
+        <w:t>inter-ciclo</w:t>
+      </w:r>
+      <w:proofErr w:type="spellEnd"/>
+      <w:r>
+        <w:rPr>
+          <w:rFonts w:ascii="Times New Roman" w:hAnsi="Times New Roman" w:cs="Times New Roman"/>
+          <w:lang w:val="es-419"/>
+        </w:rPr>
+        <w:t xml:space="preserve"> o semestral)</w:t>
       </w:r>
       <w:r>
         <w:rPr>
@@ -7078,7 +7457,27 @@
           <w:sz w:val="24"/>
           <w:szCs w:val="24"/>
         </w:rPr>
-        <w:t>Panel de Estadísticas (Dashboard):</w:t>
+        <w:t>Panel de Estadísticas (</w:t>
+      </w:r>
+      <w:proofErr w:type="spellStart"/>
+      <w:r>
+        <w:rPr>
+          <w:b/>
+          <w:bCs/>
+          <w:sz w:val="24"/>
+          <w:szCs w:val="24"/>
+        </w:rPr>
+        <w:t>Dashboard</w:t>
+      </w:r>
+      <w:proofErr w:type="spellEnd"/>
+      <w:r>
+        <w:rPr>
+          <w:b/>
+          <w:bCs/>
+          <w:sz w:val="24"/>
+          <w:szCs w:val="24"/>
+        </w:rPr>
+        <w:t>):</w:t>
       </w:r>
       <w:r>
         <w:rPr>
@@ -7331,33 +7730,51 @@
           <w:szCs w:val="24"/>
           <w:lang w:val="es-419"/>
         </w:rPr>
-        <w:t>, implementaremos un stack tecnológico robusto y moderno:</w:t>
-      </w:r>
-    </w:p>
-    <w:p>
-      <w:pPr>
-        <w:tabs>
-          <w:tab w:val="left" w:pos="1524"/>
-        </w:tabs>
-        <w:spacing w:line="360" w:lineRule="auto"/>
+        <w:t xml:space="preserve">, implementaremos un </w:t>
+      </w:r>
+      <w:proofErr w:type="spellStart"/>
+      <w:r>
         <w:rPr>
           <w:sz w:val="24"/>
           <w:szCs w:val="24"/>
           <w:lang w:val="es-419"/>
         </w:rPr>
-      </w:pPr>
-    </w:p>
-    <w:p>
-      <w:pPr>
-        <w:tabs>
-          <w:tab w:val="left" w:pos="1524"/>
-        </w:tabs>
-        <w:spacing w:line="360" w:lineRule="auto"/>
+        <w:t>stack</w:t>
+      </w:r>
+      <w:proofErr w:type="spellEnd"/>
+      <w:r>
         <w:rPr>
           <w:sz w:val="24"/>
           <w:szCs w:val="24"/>
           <w:lang w:val="es-419"/>
         </w:rPr>
+        <w:t xml:space="preserve"> tecnológico robusto y moderno:</w:t>
+      </w:r>
+    </w:p>
+    <w:p>
+      <w:pPr>
+        <w:tabs>
+          <w:tab w:val="left" w:pos="1524"/>
+        </w:tabs>
+        <w:spacing w:line="360" w:lineRule="auto"/>
+        <w:rPr>
+          <w:sz w:val="24"/>
+          <w:szCs w:val="24"/>
+          <w:lang w:val="es-419"/>
+        </w:rPr>
+      </w:pPr>
+    </w:p>
+    <w:p>
+      <w:pPr>
+        <w:tabs>
+          <w:tab w:val="left" w:pos="1524"/>
+        </w:tabs>
+        <w:spacing w:line="360" w:lineRule="auto"/>
+        <w:rPr>
+          <w:sz w:val="24"/>
+          <w:szCs w:val="24"/>
+          <w:lang w:val="es-419"/>
+        </w:rPr>
       </w:pPr>
       <w:r>
         <w:rPr>
@@ -7375,20 +7792,56 @@
           <w:szCs w:val="24"/>
           <w:lang w:val="es-419"/>
         </w:rPr>
-        <w:t xml:space="preserve"> Python, seleccionado por su legibilidad y su potencia para el procesamiento de datos. Se utilizarán técnicas de tipado estático (Type Hints) mediante FastAPI para garantizar la robustez en la lógica de negocio y reducir errores en tiempo de ejecución.</w:t>
-      </w:r>
-    </w:p>
-    <w:p>
-      <w:pPr>
-        <w:tabs>
-          <w:tab w:val="left" w:pos="1524"/>
-        </w:tabs>
-        <w:spacing w:line="360" w:lineRule="auto"/>
+        <w:t xml:space="preserve"> Python, seleccionado por su legibilidad y su potencia para el procesamiento de datos. Se utilizarán técnicas de tipado estático (</w:t>
+      </w:r>
+      <w:proofErr w:type="spellStart"/>
+      <w:r>
         <w:rPr>
           <w:sz w:val="24"/>
           <w:szCs w:val="24"/>
           <w:lang w:val="es-419"/>
         </w:rPr>
+        <w:t>Type</w:t>
+      </w:r>
+      <w:proofErr w:type="spellEnd"/>
+      <w:r>
+        <w:rPr>
+          <w:sz w:val="24"/>
+          <w:szCs w:val="24"/>
+          <w:lang w:val="es-419"/>
+        </w:rPr>
+        <w:t xml:space="preserve"> Hints) mediante </w:t>
+      </w:r>
+      <w:proofErr w:type="spellStart"/>
+      <w:r>
+        <w:rPr>
+          <w:sz w:val="24"/>
+          <w:szCs w:val="24"/>
+          <w:lang w:val="es-419"/>
+        </w:rPr>
+        <w:t>FastAPI</w:t>
+      </w:r>
+      <w:proofErr w:type="spellEnd"/>
+      <w:r>
+        <w:rPr>
+          <w:sz w:val="24"/>
+          <w:szCs w:val="24"/>
+          <w:lang w:val="es-419"/>
+        </w:rPr>
+        <w:t xml:space="preserve"> para garantizar la robustez en la lógica de negocio y reducir errores en tiempo de ejecución.</w:t>
+      </w:r>
+    </w:p>
+    <w:p>
+      <w:pPr>
+        <w:tabs>
+          <w:tab w:val="left" w:pos="1524"/>
+        </w:tabs>
+        <w:spacing w:line="360" w:lineRule="auto"/>
+        <w:rPr>
+          <w:sz w:val="24"/>
+          <w:szCs w:val="24"/>
+          <w:lang w:val="es-419"/>
+        </w:rPr>
       </w:pPr>
       <w:r>
         <w:rPr>
@@ -7437,7 +7890,25 @@
           <w:szCs w:val="24"/>
           <w:lang w:val="es-419"/>
         </w:rPr>
-        <w:t xml:space="preserve"> React en conjunto con Bootstrap, proporcionando una interfaz responsiva que permite al profesor realizar el pase de lista desde una computadora o un dispositivo móvil con la misma eficiencia.</w:t>
+        <w:t xml:space="preserve"> </w:t>
+      </w:r>
+      <w:proofErr w:type="spellStart"/>
+      <w:r>
+        <w:rPr>
+          <w:sz w:val="24"/>
+          <w:szCs w:val="24"/>
+          <w:lang w:val="es-419"/>
+        </w:rPr>
+        <w:t>React</w:t>
+      </w:r>
+      <w:proofErr w:type="spellEnd"/>
+      <w:r>
+        <w:rPr>
+          <w:sz w:val="24"/>
+          <w:szCs w:val="24"/>
+          <w:lang w:val="es-419"/>
+        </w:rPr>
+        <w:t xml:space="preserve"> en conjunto con Bootstrap, proporcionando una interfaz responsiva que permite al profesor realizar el pase de lista desde una computadora o un dispositivo móvil con la misma eficiencia.</w:t>
       </w:r>
     </w:p>
     <w:sectPr>

</xml_diff>